<commit_message>
Just updating the work document
</commit_message>
<xml_diff>
--- a/Week_7_LabActivities/Week_7_Lab_Report.docx
+++ b/Week_7_LabActivities/Week_7_Lab_Report.docx
@@ -3,11 +3,23 @@
 <w:document xmlns:wpc="http://schemas.microsoft.com/office/word/2010/wordprocessingCanvas" xmlns:cx="http://schemas.microsoft.com/office/drawing/2014/chartex" xmlns:cx1="http://schemas.microsoft.com/office/drawing/2015/9/8/chartex" xmlns:cx2="http://schemas.microsoft.com/office/drawing/2015/10/21/chartex" xmlns:cx3="http://schemas.microsoft.com/office/drawing/2016/5/9/chartex" xmlns:cx4="http://schemas.microsoft.com/office/drawing/2016/5/10/chartex" xmlns:cx5="http://schemas.microsoft.com/office/drawing/2016/5/11/chartex" xmlns:cx6="http://schemas.microsoft.com/office/drawing/2016/5/12/chartex" xmlns:cx7="http://schemas.microsoft.com/office/drawing/2016/5/13/chartex" xmlns:cx8="http://schemas.microsoft.com/office/drawing/2016/5/14/chartex" xmlns:mc="http://schemas.openxmlformats.org/markup-compatibility/2006" xmlns:aink="http://schemas.microsoft.com/office/drawing/2016/ink" xmlns:am3d="http://schemas.microsoft.com/office/drawing/2017/model3d" xmlns:o="urn:schemas-microsoft-com:office:office" xmlns:oel="http://schemas.microsoft.com/office/2019/extlst" xmlns:r="http://schemas.openxmlformats.org/officeDocument/2006/relationships" xmlns:m="http://schemas.openxmlformats.org/officeDocument/2006/math" xmlns:v="urn:schemas-microsoft-com:vml" xmlns:wp14="http://schemas.microsoft.com/office/word/2010/wordprocessingDrawing" xmlns:wp="http://schemas.openxmlformats.org/drawingml/2006/wordprocessingDrawing" xmlns:w10="urn:schemas-microsoft-com:office:word" xmlns:w="http://schemas.openxmlformats.org/wordprocessingml/2006/main" xmlns:w14="http://schemas.microsoft.com/office/word/2010/wordml" xmlns:w15="http://schemas.microsoft.com/office/word/2012/wordml" xmlns:w16cex="http://schemas.microsoft.com/office/word/2018/wordml/cex" xmlns:w16cid="http://schemas.microsoft.com/office/word/2016/wordml/cid" xmlns:w16="http://schemas.microsoft.com/office/word/2018/wordml" xmlns:w16du="http://schemas.microsoft.com/office/word/2023/wordml/word16du" xmlns:w16sdtdh="http://schemas.microsoft.com/office/word/2020/wordml/sdtdatahash" xmlns:w16sdtfl="http://schemas.microsoft.com/office/word/2024/wordml/sdtformatlock" xmlns:w16se="http://schemas.microsoft.com/office/word/2015/wordml/symex" xmlns:wpg="http://schemas.microsoft.com/office/word/2010/wordprocessingGroup" xmlns:wpi="http://schemas.microsoft.com/office/word/2010/wordprocessingInk" xmlns:wne="http://schemas.microsoft.com/office/word/2006/wordml" xmlns:wps="http://schemas.microsoft.com/office/word/2010/wordprocessingShape" mc:Ignorable="w14 w15 w16se w16cid w16 w16cex w16sdtdh w16sdtfl w16du wp14">
   <w:body>
     <w:p>
-      <w:r>
+      <w:pPr>
+        <w:rPr>
+          <w:b/>
+          <w:bCs/>
+        </w:rPr>
+      </w:pPr>
+      <w:r>
+        <w:rPr>
+          <w:b/>
+          <w:bCs/>
+        </w:rPr>
         <w:t xml:space="preserve">Task 1 outputs </w:t>
       </w:r>
       <w:r>
         <w:rPr>
+          <w:b/>
+          <w:bCs/>
           <w:noProof/>
         </w:rPr>
         <w:drawing>
@@ -57,10 +69,24 @@
     </w:p>
     <w:p/>
     <w:p>
-      <w:r>
+      <w:pPr>
+        <w:rPr>
+          <w:b/>
+          <w:bCs/>
+        </w:rPr>
+      </w:pPr>
+      <w:r>
+        <w:rPr>
+          <w:b/>
+          <w:bCs/>
+        </w:rPr>
         <w:t xml:space="preserve">Task </w:t>
       </w:r>
       <w:r>
+        <w:rPr>
+          <w:b/>
+          <w:bCs/>
+        </w:rPr>
         <w:t>2 outputs</w:t>
       </w:r>
     </w:p>
@@ -307,7 +333,17 @@
     </w:p>
     <w:p/>
     <w:p>
-      <w:r>
+      <w:pPr>
+        <w:rPr>
+          <w:b/>
+          <w:bCs/>
+        </w:rPr>
+      </w:pPr>
+      <w:r>
+        <w:rPr>
+          <w:b/>
+          <w:bCs/>
+        </w:rPr>
         <w:lastRenderedPageBreak/>
         <w:t>Task 3</w:t>
       </w:r>
@@ -489,7 +525,18 @@
     </w:p>
     <w:p/>
     <w:p>
-      <w:r>
+      <w:pPr>
+        <w:rPr>
+          <w:b/>
+          <w:bCs/>
+        </w:rPr>
+      </w:pPr>
+      <w:r>
+        <w:rPr>
+          <w:b/>
+          <w:bCs/>
+          <w:noProof/>
+        </w:rPr>
         <w:drawing>
           <wp:anchor distT="0" distB="0" distL="114300" distR="114300" simplePos="0" relativeHeight="251677696" behindDoc="0" locked="0" layoutInCell="1" allowOverlap="1" wp14:anchorId="21566C97" wp14:editId="6E32B828">
             <wp:simplePos x="0" y="0"/>
@@ -541,6 +588,11 @@
         </w:drawing>
       </w:r>
       <w:r>
+        <w:rPr>
+          <w:b/>
+          <w:bCs/>
+          <w:noProof/>
+        </w:rPr>
         <w:drawing>
           <wp:anchor distT="0" distB="0" distL="114300" distR="114300" simplePos="0" relativeHeight="251675648" behindDoc="0" locked="0" layoutInCell="1" allowOverlap="1" wp14:anchorId="4EF7EAAC" wp14:editId="4F8779BE">
             <wp:simplePos x="0" y="0"/>
@@ -592,6 +644,10 @@
         </w:drawing>
       </w:r>
       <w:r>
+        <w:rPr>
+          <w:b/>
+          <w:bCs/>
+        </w:rPr>
         <w:t>Task 4</w:t>
       </w:r>
     </w:p>
@@ -616,6 +672,9 @@
     <w:p/>
     <w:p>
       <w:r>
+        <w:rPr>
+          <w:noProof/>
+        </w:rPr>
         <w:lastRenderedPageBreak/>
         <w:drawing>
           <wp:anchor distT="0" distB="0" distL="114300" distR="114300" simplePos="0" relativeHeight="251681792" behindDoc="0" locked="0" layoutInCell="1" allowOverlap="1" wp14:anchorId="495F984F" wp14:editId="5A87E704">
@@ -675,6 +734,9 @@
         <w:br/>
       </w:r>
       <w:r>
+        <w:rPr>
+          <w:noProof/>
+        </w:rPr>
         <w:drawing>
           <wp:anchor distT="0" distB="0" distL="114300" distR="114300" simplePos="0" relativeHeight="251683840" behindDoc="0" locked="0" layoutInCell="1" allowOverlap="1" wp14:anchorId="1A95195A" wp14:editId="64FA4FCF">
             <wp:simplePos x="0" y="0"/>
@@ -725,6 +787,9 @@
     <w:p/>
     <w:p>
       <w:r>
+        <w:rPr>
+          <w:noProof/>
+        </w:rPr>
         <w:lastRenderedPageBreak/>
         <w:drawing>
           <wp:anchor distT="0" distB="0" distL="114300" distR="114300" simplePos="0" relativeHeight="251679744" behindDoc="0" locked="0" layoutInCell="1" allowOverlap="1" wp14:anchorId="533CD255" wp14:editId="6D2FADBF">
@@ -783,35 +848,104 @@
     <w:p/>
     <w:p>
       <w:r>
-        <w:rPr>
-          <w:highlight w:val="yellow"/>
-        </w:rPr>
-        <w:t>Need to provide a discussion</w:t>
+        <w:t xml:space="preserve">The benchmark </w:t>
+      </w:r>
+      <w:r>
+        <w:t xml:space="preserve">results for the </w:t>
+      </w:r>
+      <w:r>
+        <w:t xml:space="preserve">input values support the </w:t>
+      </w:r>
+      <w:r>
+        <w:t>theoretical differences between Binary Search Trees (BSTs) and AVL trees.</w:t>
+      </w:r>
+      <w:r>
+        <w:t xml:space="preserve"> F</w:t>
+      </w:r>
+      <w:r>
+        <w:t>or insertion operations, the AVL tree consistently takes slightly longer than the BST,</w:t>
+      </w:r>
+      <w:r>
+        <w:t xml:space="preserve"> this supports the </w:t>
+      </w:r>
+      <w:r>
+        <w:t>since AVL trees require additional rotations and height updates to maintain balance. In contrast, the BST performs insertions faster in these tests because it does not enforce balancing, although this advantage depends on the input data not being skewed.</w:t>
       </w:r>
       <w:r>
         <w:t xml:space="preserve"> </w:t>
+      </w:r>
+      <w:r>
+        <w:t>For search operations, both BST and AVL trees exhibit nearly identical performance, with negligible time differences across all input sizes.</w:t>
+      </w:r>
+      <w:r>
+        <w:t xml:space="preserve"> </w:t>
+      </w:r>
+      <w:r>
+        <w:t xml:space="preserve">In terms of deletion, the AVL tree again shows slightly higher execution times due to the need for rebalancing after node removal, whereas the BST performs deletions more quickly but without maintaining structural balance. Overall, the results confirm that while BSTs may appear faster for random datasets, their performance can degrade significantly with unfavourable input orders, such as sorted data. AVL trees, on the other hand, maintain a strict height balance, ensuring consistent </w:t>
+      </w:r>
+      <m:oMath>
+        <m:r>
+          <w:rPr>
+            <w:rFonts w:ascii="Cambria Math" w:hAnsi="Cambria Math"/>
+          </w:rPr>
+          <m:t>O(</m:t>
+        </m:r>
+        <m:r>
+          <m:rPr>
+            <m:sty m:val="p"/>
+          </m:rPr>
+          <w:rPr>
+            <w:rFonts w:ascii="Cambria Math" w:hAnsi="Cambria Math"/>
+          </w:rPr>
+          <m:t>log</m:t>
+        </m:r>
+        <m:r>
+          <w:rPr>
+            <w:rFonts w:ascii="Cambria Math" w:hAnsi="Cambria Math"/>
+          </w:rPr>
+          <m:t>⁡n)</m:t>
+        </m:r>
+      </m:oMath>
+      <w:r>
+        <w:t>performance for insertion, search, and deletion. Additionally, the overhead introduced by AVL rotations is relatively small compared to the benefit of avoiding worst-case scenarios, making AVL trees more reliable for large and unpredictable datasets.</w:t>
       </w:r>
     </w:p>
     <w:p>
-      <w:r>
+      <w:pPr>
+        <w:rPr>
+          <w:b/>
+          <w:bCs/>
+        </w:rPr>
+      </w:pPr>
+      <w:r>
+        <w:rPr>
+          <w:b/>
+          <w:bCs/>
+        </w:rPr>
         <w:t xml:space="preserve">Task 5 </w:t>
       </w:r>
     </w:p>
     <w:p>
       <w:r>
+        <w:t>Example of inserting and finding</w:t>
+      </w:r>
+    </w:p>
+    <w:p>
+      <w:r>
+        <w:lastRenderedPageBreak/>
         <w:drawing>
-          <wp:anchor distT="0" distB="0" distL="114300" distR="114300" simplePos="0" relativeHeight="251685888" behindDoc="0" locked="0" layoutInCell="1" allowOverlap="1" wp14:anchorId="36EAF682" wp14:editId="59027811">
+          <wp:anchor distT="0" distB="0" distL="114300" distR="114300" simplePos="0" relativeHeight="251685888" behindDoc="0" locked="0" layoutInCell="1" allowOverlap="1" wp14:anchorId="3A09DDBB" wp14:editId="278C29F9">
             <wp:simplePos x="0" y="0"/>
-            <wp:positionH relativeFrom="margin">
-              <wp:posOffset>-110490</wp:posOffset>
+            <wp:positionH relativeFrom="column">
+              <wp:posOffset>0</wp:posOffset>
             </wp:positionH>
             <wp:positionV relativeFrom="paragraph">
-              <wp:posOffset>393700</wp:posOffset>
+              <wp:posOffset>283845</wp:posOffset>
             </wp:positionV>
-            <wp:extent cx="5731510" cy="2927985"/>
-            <wp:effectExtent l="0" t="0" r="2540" b="5715"/>
+            <wp:extent cx="5562886" cy="4038808"/>
+            <wp:effectExtent l="0" t="0" r="0" b="0"/>
             <wp:wrapTopAndBottom/>
-            <wp:docPr id="1213119239" name="Picture 1"/>
+            <wp:docPr id="299983985" name="Picture 1"/>
             <wp:cNvGraphicFramePr>
               <a:graphicFrameLocks xmlns:a="http://schemas.openxmlformats.org/drawingml/2006/main" noChangeAspect="1"/>
             </wp:cNvGraphicFramePr>
@@ -819,7 +953,7 @@
               <a:graphicData uri="http://schemas.openxmlformats.org/drawingml/2006/picture">
                 <pic:pic xmlns:pic="http://schemas.openxmlformats.org/drawingml/2006/picture">
                   <pic:nvPicPr>
-                    <pic:cNvPr id="1213119239" name=""/>
+                    <pic:cNvPr id="299983985" name=""/>
                     <pic:cNvPicPr/>
                   </pic:nvPicPr>
                   <pic:blipFill>
@@ -831,7 +965,7 @@
                   <pic:spPr>
                     <a:xfrm>
                       <a:off x="0" y="0"/>
-                      <a:ext cx="5731510" cy="2927985"/>
+                      <a:ext cx="5562886" cy="4038808"/>
                     </a:xfrm>
                     <a:prstGeom prst="rect">
                       <a:avLst/>
@@ -843,46 +977,126 @@
           </wp:anchor>
         </w:drawing>
       </w:r>
-      <w:r>
-        <w:t>Example of inserting and finding</w:t>
-      </w:r>
     </w:p>
-    <w:p/>
     <w:p>
-      <w:pPr>
-        <w:ind w:firstLine="720"/>
-      </w:pPr>
+      <w:r>
+        <w:t xml:space="preserve">Deleting and showing the rebalancing </w:t>
+      </w:r>
     </w:p>
     <w:p>
       <w:pPr>
         <w:ind w:firstLine="720"/>
       </w:pPr>
+      <w:r>
+        <w:drawing>
+          <wp:anchor distT="0" distB="0" distL="114300" distR="114300" simplePos="0" relativeHeight="251687936" behindDoc="0" locked="0" layoutInCell="1" allowOverlap="1" wp14:anchorId="2657F51F" wp14:editId="552F571C">
+            <wp:simplePos x="0" y="0"/>
+            <wp:positionH relativeFrom="margin">
+              <wp:align>left</wp:align>
+            </wp:positionH>
+            <wp:positionV relativeFrom="paragraph">
+              <wp:posOffset>287020</wp:posOffset>
+            </wp:positionV>
+            <wp:extent cx="4577715" cy="3376930"/>
+            <wp:effectExtent l="0" t="0" r="0" b="0"/>
+            <wp:wrapTopAndBottom/>
+            <wp:docPr id="1410338132" name="Picture 1"/>
+            <wp:cNvGraphicFramePr>
+              <a:graphicFrameLocks xmlns:a="http://schemas.openxmlformats.org/drawingml/2006/main" noChangeAspect="1"/>
+            </wp:cNvGraphicFramePr>
+            <a:graphic xmlns:a="http://schemas.openxmlformats.org/drawingml/2006/main">
+              <a:graphicData uri="http://schemas.openxmlformats.org/drawingml/2006/picture">
+                <pic:pic xmlns:pic="http://schemas.openxmlformats.org/drawingml/2006/picture">
+                  <pic:nvPicPr>
+                    <pic:cNvPr id="1410338132" name=""/>
+                    <pic:cNvPicPr/>
+                  </pic:nvPicPr>
+                  <pic:blipFill>
+                    <a:blip r:embed="rId18"/>
+                    <a:stretch>
+                      <a:fillRect/>
+                    </a:stretch>
+                  </pic:blipFill>
+                  <pic:spPr>
+                    <a:xfrm>
+                      <a:off x="0" y="0"/>
+                      <a:ext cx="4577715" cy="3376930"/>
+                    </a:xfrm>
+                    <a:prstGeom prst="rect">
+                      <a:avLst/>
+                    </a:prstGeom>
+                  </pic:spPr>
+                </pic:pic>
+              </a:graphicData>
+            </a:graphic>
+            <wp14:sizeRelH relativeFrom="margin">
+              <wp14:pctWidth>0</wp14:pctWidth>
+            </wp14:sizeRelH>
+            <wp14:sizeRelV relativeFrom="margin">
+              <wp14:pctHeight>0</wp14:pctHeight>
+            </wp14:sizeRelV>
+          </wp:anchor>
+        </w:drawing>
+      </w:r>
     </w:p>
+    <w:p/>
     <w:p>
-      <w:pPr>
-        <w:ind w:firstLine="720"/>
-      </w:pPr>
+      <w:r>
+        <w:lastRenderedPageBreak/>
+        <w:drawing>
+          <wp:anchor distT="0" distB="0" distL="114300" distR="114300" simplePos="0" relativeHeight="251689984" behindDoc="0" locked="0" layoutInCell="1" allowOverlap="1" wp14:anchorId="35921D47" wp14:editId="2853E3C1">
+            <wp:simplePos x="0" y="0"/>
+            <wp:positionH relativeFrom="margin">
+              <wp:posOffset>364096</wp:posOffset>
+            </wp:positionH>
+            <wp:positionV relativeFrom="paragraph">
+              <wp:posOffset>262247</wp:posOffset>
+            </wp:positionV>
+            <wp:extent cx="5121798" cy="4363465"/>
+            <wp:effectExtent l="0" t="0" r="3175" b="0"/>
+            <wp:wrapTopAndBottom/>
+            <wp:docPr id="478915159" name="Picture 1"/>
+            <wp:cNvGraphicFramePr>
+              <a:graphicFrameLocks xmlns:a="http://schemas.openxmlformats.org/drawingml/2006/main" noChangeAspect="1"/>
+            </wp:cNvGraphicFramePr>
+            <a:graphic xmlns:a="http://schemas.openxmlformats.org/drawingml/2006/main">
+              <a:graphicData uri="http://schemas.openxmlformats.org/drawingml/2006/picture">
+                <pic:pic xmlns:pic="http://schemas.openxmlformats.org/drawingml/2006/picture">
+                  <pic:nvPicPr>
+                    <pic:cNvPr id="478915159" name=""/>
+                    <pic:cNvPicPr/>
+                  </pic:nvPicPr>
+                  <pic:blipFill>
+                    <a:blip r:embed="rId19"/>
+                    <a:stretch>
+                      <a:fillRect/>
+                    </a:stretch>
+                  </pic:blipFill>
+                  <pic:spPr>
+                    <a:xfrm>
+                      <a:off x="0" y="0"/>
+                      <a:ext cx="5121798" cy="4363465"/>
+                    </a:xfrm>
+                    <a:prstGeom prst="rect">
+                      <a:avLst/>
+                    </a:prstGeom>
+                  </pic:spPr>
+                </pic:pic>
+              </a:graphicData>
+            </a:graphic>
+            <wp14:sizeRelH relativeFrom="margin">
+              <wp14:pctWidth>0</wp14:pctWidth>
+            </wp14:sizeRelH>
+            <wp14:sizeRelV relativeFrom="margin">
+              <wp14:pctHeight>0</wp14:pctHeight>
+            </wp14:sizeRelV>
+          </wp:anchor>
+        </w:drawing>
+      </w:r>
+      <w:r>
+        <w:t xml:space="preserve">Running the benchmark </w:t>
+      </w:r>
     </w:p>
-    <w:p>
-      <w:pPr>
-        <w:ind w:firstLine="720"/>
-      </w:pPr>
-    </w:p>
-    <w:p>
-      <w:pPr>
-        <w:ind w:firstLine="720"/>
-      </w:pPr>
-      <w:r>
-        <w:lastRenderedPageBreak/>
-        <w:t xml:space="preserve">Deleting and showing the rebalancing </w:t>
-      </w:r>
-    </w:p>
-    <w:p>
-      <w:pPr>
-        <w:ind w:firstLine="720"/>
-      </w:pPr>
-    </w:p>
-    <w:p/>
     <w:p/>
     <w:p/>
     <w:p/>
@@ -1504,7 +1718,6 @@
   <w:style w:type="character" w:default="1" w:styleId="DefaultParagraphFont">
     <w:name w:val="Default Paragraph Font"/>
     <w:uiPriority w:val="1"/>
-    <w:semiHidden/>
     <w:unhideWhenUsed/>
   </w:style>
   <w:style w:type="table" w:default="1" w:styleId="TableNormal">

</xml_diff>